<commit_message>
fix: correct author name to Qin Yi (秦溢/진일)
</commit_message>
<xml_diff>
--- a/K-SAFE3D_论文.docx
+++ b/K-SAFE3D_论文.docx
@@ -105,7 +105,7 @@
           <w:sz w:val="26"/>
           <w:szCs w:val="26"/>
         </w:rPr>
-        <w:t xml:space="preserve">研发人：李志秀（이지수）</w:t>
+        <w:t xml:space="preserve">研发人：秦溢（진일）</w:t>
       </w:r>
     </w:p>
     <w:p>
@@ -4581,7 +4581,7 @@
         <w:sz w:val="18"/>
         <w:szCs w:val="18"/>
       </w:rPr>
-      <w:t xml:space="preserve"> 页 | 研发人：李志秀 | 庆云大学 物理治疗系 | 2026</w:t>
+      <w:t xml:space="preserve"> 页 | 研发人：秦溢 | 庆云大学 物理治疗系 | 2026</w:t>
     </w:r>
   </w:p>
 </w:ftr>

</xml_diff>